<commit_message>
chore: commit project changes
</commit_message>
<xml_diff>
--- a/course-content/authoring/shared/homework-problems/T5.docx
+++ b/course-content/authoring/shared/homework-problems/T5.docx
@@ -13,7 +13,7 @@
           <w:b/>
           <w:sz w:val="32"/>
         </w:rPr>
-        <w:t>自动控制原理 作业5：初始控制方案与参数起点</w:t>
+        <w:t>自动控制原理 作业5：传统校正技术与初始控制方案</w:t>
       </w:r>
     </w:p>
     <w:p>
@@ -39,7 +39,7 @@
           <w:b/>
           <w:sz w:val="26"/>
         </w:rPr>
-        <w:t>T5-1 由任务约束反推首轮参数起点（20分）</w:t>
+        <w:t>T5-1 由性能要求反推首轮参数起点（20分）</w:t>
       </w:r>
     </w:p>
     <w:p>
@@ -52,7 +52,7 @@
           <w:b w:val="0"/>
           <w:sz w:val="22"/>
         </w:rPr>
-        <w:t>某单位过程模型为 $G(s)=1/[s(s+2)]$，单位反馈下需选择一条首轮超前校正起点参数，使系统同时满足：$M_p\le10\%$、$T_s\le2\,\mathrm{s}$（按 `2%` 判据）、闭环目标相位裕度 $\phi_m\ge50^\circ$。作业要求仅给出“首轮参数起点”，不得完成最终优化。为避免起点选择歧义，本题固定首轮交叉频率取 $\omega_c=5\,\mathrm{rad/s}$。</w:t>
+        <w:t>某单位过程模型为 $G(s)=1/[s(s+2)]$，单位反馈下需选择一条首轮超前校正起点参数，使系统同时满足：$M_p\le10\%$、$T_s\le2\,\mathrm{s}$（按 `2%` 判据）、闭环目标相位裕度 $\phi_m\ge50^\circ$。作业要求仅给出“首轮参数起点”。为避免起点选择歧义，本题固定首轮交叉频率取 $\omega_c=5\,\mathrm{rad/s}$。</w:t>
       </w:r>
     </w:p>
     <w:p>
@@ -79,7 +79,7 @@
           <w:b w:val="0"/>
           <w:sz w:val="22"/>
         </w:rPr>
-        <w:t>先由时域约束反推 $\zeta$ 与 $\omega_n$ 下限。</w:t>
+        <w:t>先由超调与调节时间要求反推 $\zeta$ 与 $\omega_n$ 下限。</w:t>
       </w:r>
     </w:p>
     <w:p>
@@ -121,7 +121,7 @@
           <w:b w:val="0"/>
           <w:sz w:val="22"/>
         </w:rPr>
-        <w:t>由超前校正第一型参数形式 $C(s)=K_c\frac{1+sT}{1+\alpha sT},\,0&lt;\alpha&lt;1$ 给出首轮参数起点 $(\alpha,T,K_c)$，并说明该结果只是首轮验证起点，不是最终最优参数。</w:t>
+        <w:t>由超前校正第一型参数形式 $C(s)=K_c\frac{1+sT}{1+\alpha sT},\,0&lt;\alpha&lt;1$ 给出首轮参数起点 $(\alpha,T,K_c)$，并说明该结果只是首轮验证起点。</w:t>
       </w:r>
     </w:p>
     <w:p>
@@ -134,7 +134,7 @@
           <w:b/>
           <w:sz w:val="26"/>
         </w:rPr>
-        <w:t>T5-2 目标、约束、权重偏好到目标函数语言（20分）</w:t>
+        <w:t>T5-2 从证据判断到滞后校正整定（20分）</w:t>
       </w:r>
     </w:p>
     <w:p>
@@ -147,7 +147,74 @@
           <w:b w:val="0"/>
           <w:sz w:val="22"/>
         </w:rPr>
-        <w:t>某电液伺服执行机构的速度闭环面向三类任务：</w:t>
+        <w:t>某单位负反馈控制系统的未校正开环传递函数为</w:t>
+      </w:r>
+    </w:p>
+    <w:p>
+      <w:pPr>
+        <w:spacing w:after="80"/>
+        <w:jc w:val="center"/>
+      </w:pPr>
+      <w:r>
+        <w:rPr>
+          <w:rFonts w:ascii="Arial Unicode MS" w:hAnsi="Arial Unicode MS" w:eastAsia="Arial Unicode MS"/>
+          <w:b w:val="0"/>
+          <w:sz w:val="20"/>
+        </w:rPr>
+        <w:t>L_0(s)=G(s)=\frac{4}{s(0.1s+1)(0.05s+1)}.</w:t>
+      </w:r>
+    </w:p>
+    <w:p>
+      <w:pPr>
+        <w:spacing w:after="80"/>
+      </w:pPr>
+      <w:r>
+        <w:rPr>
+          <w:rFonts w:ascii="Microsoft YaHei" w:hAnsi="Microsoft YaHei" w:eastAsia="Microsoft YaHei"/>
+          <w:b w:val="0"/>
+          <w:sz w:val="22"/>
+        </w:rPr>
+        <w:t>已知未校正系统的频域证据为：幅值交叉频率约为 $\omega_{c0}=3.6\,\mathrm{rad/s}$，相位裕度约为 $\gamma_0=60^\circ$。稳态证据为：系统对单位斜坡输入的稳态误差偏大。设计要求为：</w:t>
+      </w:r>
+    </w:p>
+    <w:p>
+      <w:pPr>
+        <w:spacing w:after="80"/>
+        <w:jc w:val="center"/>
+      </w:pPr>
+      <w:r>
+        <w:rPr>
+          <w:rFonts w:ascii="Arial Unicode MS" w:hAnsi="Arial Unicode MS" w:eastAsia="Arial Unicode MS"/>
+          <w:b w:val="0"/>
+          <w:sz w:val="20"/>
+        </w:rPr>
+        <w:t>e_{ss,\mathrm{ramp}}\le 0.05,\qquad \gamma\ge 50^\circ.</w:t>
+      </w:r>
+    </w:p>
+    <w:p>
+      <w:pPr>
+        <w:spacing w:after="80"/>
+      </w:pPr>
+      <w:r>
+        <w:rPr>
+          <w:rFonts w:ascii="Microsoft YaHei" w:hAnsi="Microsoft YaHei" w:eastAsia="Microsoft YaHei"/>
+          <w:b w:val="0"/>
+          <w:sz w:val="22"/>
+        </w:rPr>
+        <w:t>同时希望主要改善低频稳态精度，不要求明显提高交叉频率。</w:t>
+      </w:r>
+    </w:p>
+    <w:p>
+      <w:pPr>
+        <w:spacing w:after="80"/>
+      </w:pPr>
+      <w:r>
+        <w:rPr>
+          <w:rFonts w:ascii="Microsoft YaHei" w:hAnsi="Microsoft YaHei" w:eastAsia="Microsoft YaHei"/>
+          <w:b w:val="0"/>
+          <w:sz w:val="22"/>
+        </w:rPr>
+        <w:t>请完成以下任务：</w:t>
       </w:r>
     </w:p>
     <w:p>
@@ -161,7 +228,7 @@
           <w:b w:val="0"/>
           <w:sz w:val="22"/>
         </w:rPr>
-        <w:t>短时定位到位，重点关注时域性能。</w:t>
+        <w:t>计算未校正系统的速度误差系数 $K_v$ 与单位斜坡输入稳态误差。</w:t>
       </w:r>
     </w:p>
     <w:p>
@@ -175,7 +242,7 @@
           <w:b w:val="0"/>
           <w:sz w:val="22"/>
         </w:rPr>
-        <w:t>面对机械振动和参数摄动时保持可接受的鲁棒性，重点关注频域裕度。</w:t>
+        <w:t>根据给出的稳态误差、低频增益和相位裕度证据，说明为什么本题应采用滞后校正。</w:t>
       </w:r>
     </w:p>
     <w:p>
@@ -189,7 +256,21 @@
           <w:b w:val="0"/>
           <w:sz w:val="22"/>
         </w:rPr>
-        <w:t>周期工况下能耗受控，重点关注控制量代价。</w:t>
+        <w:t>采用滞后校正网络</w:t>
+      </w:r>
+    </w:p>
+    <w:p>
+      <w:pPr>
+        <w:spacing w:after="80"/>
+        <w:jc w:val="center"/>
+      </w:pPr>
+      <w:r>
+        <w:rPr>
+          <w:rFonts w:ascii="Arial Unicode MS" w:hAnsi="Arial Unicode MS" w:eastAsia="Arial Unicode MS"/>
+          <w:b w:val="0"/>
+          <w:sz w:val="20"/>
+        </w:rPr>
+        <w:t>C(s)=\beta \frac{1+s/\omega_z}{1+s/\omega_p},\qquad \omega_p=\frac{\omega_z}{\beta},\quad \beta&gt;1</w:t>
       </w:r>
     </w:p>
     <w:p>
@@ -202,132 +283,7 @@
           <w:b w:val="0"/>
           <w:sz w:val="22"/>
         </w:rPr>
-        <w:t>现有初始方案需要围绕以下指标建立一版无约束加权目标函数语言：</w:t>
-      </w:r>
-    </w:p>
-    <w:p>
-      <w:pPr>
-        <w:pStyle w:val="ListBullet"/>
-        <w:spacing w:after="80"/>
-      </w:pPr>
-      <w:r>
-        <w:rPr>
-          <w:rFonts w:ascii="Microsoft YaHei" w:hAnsi="Microsoft YaHei" w:eastAsia="Microsoft YaHei"/>
-          <w:b w:val="0"/>
-          <w:sz w:val="22"/>
-        </w:rPr>
-        <w:t>上升时间：$t_r \le 1.6\,\mathrm{s}$；</w:t>
-      </w:r>
-    </w:p>
-    <w:p>
-      <w:pPr>
-        <w:pStyle w:val="ListBullet"/>
-        <w:spacing w:after="80"/>
-      </w:pPr>
-      <w:r>
-        <w:rPr>
-          <w:rFonts w:ascii="Microsoft YaHei" w:hAnsi="Microsoft YaHei" w:eastAsia="Microsoft YaHei"/>
-          <w:b w:val="0"/>
-          <w:sz w:val="22"/>
-        </w:rPr>
-        <w:t>超调量：$M_p \le 15\%$；</w:t>
-      </w:r>
-    </w:p>
-    <w:p>
-      <w:pPr>
-        <w:pStyle w:val="ListBullet"/>
-        <w:spacing w:after="80"/>
-      </w:pPr>
-      <w:r>
-        <w:rPr>
-          <w:rFonts w:ascii="Microsoft YaHei" w:hAnsi="Microsoft YaHei" w:eastAsia="Microsoft YaHei"/>
-          <w:b w:val="0"/>
-          <w:sz w:val="22"/>
-        </w:rPr>
-        <w:t>稳态误差：$e_{ss} \le 1\%$；</w:t>
-      </w:r>
-    </w:p>
-    <w:p>
-      <w:pPr>
-        <w:pStyle w:val="ListBullet"/>
-        <w:spacing w:after="80"/>
-      </w:pPr>
-      <w:r>
-        <w:rPr>
-          <w:rFonts w:ascii="Microsoft YaHei" w:hAnsi="Microsoft YaHei" w:eastAsia="Microsoft YaHei"/>
-          <w:b w:val="0"/>
-          <w:sz w:val="22"/>
-        </w:rPr>
-        <w:t>扰动抑制时间：$t_d \le 0.8\,\mathrm{s}$；</w:t>
-      </w:r>
-    </w:p>
-    <w:p>
-      <w:pPr>
-        <w:pStyle w:val="ListBullet"/>
-        <w:spacing w:after="80"/>
-      </w:pPr>
-      <w:r>
-        <w:rPr>
-          <w:rFonts w:ascii="Microsoft YaHei" w:hAnsi="Microsoft YaHei" w:eastAsia="Microsoft YaHei"/>
-          <w:b w:val="0"/>
-          <w:sz w:val="22"/>
-        </w:rPr>
-        <w:t>相位裕度：$\phi_m \ge 45^\circ$；</w:t>
-      </w:r>
-    </w:p>
-    <w:p>
-      <w:pPr>
-        <w:pStyle w:val="ListBullet"/>
-        <w:spacing w:after="80"/>
-      </w:pPr>
-      <w:r>
-        <w:rPr>
-          <w:rFonts w:ascii="Microsoft YaHei" w:hAnsi="Microsoft YaHei" w:eastAsia="Microsoft YaHei"/>
-          <w:b w:val="0"/>
-          <w:sz w:val="22"/>
-        </w:rPr>
-        <w:t>闭环带宽：$\omega_c \ge 3\,\mathrm{rad/s}$；</w:t>
-      </w:r>
-    </w:p>
-    <w:p>
-      <w:pPr>
-        <w:pStyle w:val="ListBullet"/>
-        <w:spacing w:after="80"/>
-      </w:pPr>
-      <w:r>
-        <w:rPr>
-          <w:rFonts w:ascii="Microsoft YaHei" w:hAnsi="Microsoft YaHei" w:eastAsia="Microsoft YaHei"/>
-          <w:b w:val="0"/>
-          <w:sz w:val="22"/>
-        </w:rPr>
-        <w:t>控制能量：$\int_0^{t_f}u^2(t)\,dt \le 6\,\mathrm{V^2\cdot s}$；</w:t>
-      </w:r>
-    </w:p>
-    <w:p>
-      <w:pPr>
-        <w:pStyle w:val="ListBullet"/>
-        <w:spacing w:after="80"/>
-      </w:pPr>
-      <w:r>
-        <w:rPr>
-          <w:rFonts w:ascii="Microsoft YaHei" w:hAnsi="Microsoft YaHei" w:eastAsia="Microsoft YaHei"/>
-          <w:b w:val="0"/>
-          <w:sz w:val="22"/>
-        </w:rPr>
-        <w:t>阻尼系数目标范围：$\zeta \in [0.55,0.80]$。</w:t>
-      </w:r>
-    </w:p>
-    <w:p>
-      <w:pPr>
-        <w:spacing w:after="80"/>
-      </w:pPr>
-      <w:r>
-        <w:rPr>
-          <w:rFonts w:ascii="Microsoft YaHei" w:hAnsi="Microsoft YaHei" w:eastAsia="Microsoft YaHei"/>
-          <w:b w:val="0"/>
-          <w:sz w:val="22"/>
-        </w:rPr>
-        <w:t>请完成以下四项：</w:t>
+        <w:t>完成参数整定。可取滞后网络零点位于未校正交叉频率的十分之一附近，即 $\omega_z=\omega_{c0}/10$。</w:t>
       </w:r>
     </w:p>
     <w:p>
@@ -341,7 +297,166 @@
           <w:b w:val="0"/>
           <w:sz w:val="22"/>
         </w:rPr>
-        <w:t>把上述需求整理为可执行的目标项，说明每个指标属于哪一类性能目标。</w:t>
+        <w:t>写出校正器 $C(s)$，估计校正后的速度误差系数、单位斜坡稳态误差、交叉频率和相位裕度，并说明整定结果如何改善原证据中的问题。</w:t>
+      </w:r>
+    </w:p>
+    <w:p>
+      <w:pPr>
+        <w:spacing w:after="80"/>
+      </w:pPr>
+      <w:r>
+        <w:rPr>
+          <w:rFonts w:ascii="Microsoft YaHei" w:hAnsi="Microsoft YaHei" w:eastAsia="Microsoft YaHei"/>
+          <w:b w:val="0"/>
+          <w:sz w:val="22"/>
+        </w:rPr>
+        <w:t>本题不要求仿真验证。</w:t>
+      </w:r>
+    </w:p>
+    <w:p>
+      <w:pPr>
+        <w:spacing w:before="160" w:after="120"/>
+      </w:pPr>
+      <w:r>
+        <w:rPr>
+          <w:rFonts w:ascii="Microsoft YaHei" w:hAnsi="Microsoft YaHei" w:eastAsia="Microsoft YaHei"/>
+          <w:b/>
+          <w:sz w:val="26"/>
+        </w:rPr>
+        <w:t>T5-3 给定对象下的复合控制方案选择（20分）</w:t>
+      </w:r>
+    </w:p>
+    <w:p>
+      <w:pPr>
+        <w:spacing w:after="80"/>
+      </w:pPr>
+      <w:r>
+        <w:rPr>
+          <w:rFonts w:ascii="Microsoft YaHei" w:hAnsi="Microsoft YaHei" w:eastAsia="Microsoft YaHei"/>
+          <w:b w:val="0"/>
+          <w:sz w:val="22"/>
+        </w:rPr>
+        <w:t>某薄膜涂布生产线的收卷前牵引辊需要保持稳定线速度。牵引辊由直流伺服电机驱动。为便于表达扰动作用位置，工程上将对象分为执行机构与负载结构两部分：驱动电压指令先经过执行机构形成牵引作用，牵引作用再与负载扰动共同进入负载结构，最终影响辊筒速度。</w:t>
+      </w:r>
+    </w:p>
+    <w:p>
+      <w:pPr>
+        <w:spacing w:after="80"/>
+        <w:jc w:val="center"/>
+      </w:pPr>
+      <w:r>
+        <w:rPr>
+          <w:rFonts w:ascii="Arial Unicode MS" w:hAnsi="Arial Unicode MS" w:eastAsia="Arial Unicode MS"/>
+          <w:b w:val="0"/>
+          <w:sz w:val="20"/>
+        </w:rPr>
+        <w:t>G_a(s):\quad \frac{1.8}{0.08s+1}.</w:t>
+      </w:r>
+    </w:p>
+    <w:p>
+      <w:pPr>
+        <w:spacing w:after="80"/>
+      </w:pPr>
+      <w:r>
+        <w:rPr>
+          <w:rFonts w:ascii="Microsoft YaHei" w:hAnsi="Microsoft YaHei" w:eastAsia="Microsoft YaHei"/>
+          <w:b w:val="0"/>
+          <w:sz w:val="22"/>
+        </w:rPr>
+        <w:t>负载结构可近似为</w:t>
+      </w:r>
+    </w:p>
+    <w:p>
+      <w:pPr>
+        <w:spacing w:after="80"/>
+        <w:jc w:val="center"/>
+      </w:pPr>
+      <w:r>
+        <w:rPr>
+          <w:rFonts w:ascii="Arial Unicode MS" w:hAnsi="Arial Unicode MS" w:eastAsia="Arial Unicode MS"/>
+          <w:b w:val="0"/>
+          <w:sz w:val="20"/>
+        </w:rPr>
+        <w:t>G_l(s):\quad \frac{1}{0.18s+1}e^{-0.04s}.</w:t>
+      </w:r>
+    </w:p>
+    <w:p>
+      <w:pPr>
+        <w:spacing w:after="80"/>
+      </w:pPr>
+      <w:r>
+        <w:rPr>
+          <w:rFonts w:ascii="Microsoft YaHei" w:hAnsi="Microsoft YaHei" w:eastAsia="Microsoft YaHei"/>
+          <w:b w:val="0"/>
+          <w:sz w:val="22"/>
+        </w:rPr>
+        <w:t>其中 $u$ 为驱动电压指令，$\omega$ 为辊筒角速度。负载扰动 $d$ 主要来自膜卷半径变化、材料张力波动和接头通过时的瞬时阻力，可在负载结构前直接与牵引作用共同影响速度。题面对象、扰动作用位置和待选择复合控制结构的关系如图所示。</w:t>
+      </w:r>
+    </w:p>
+    <w:p>
+      <w:pPr>
+        <w:jc w:val="center"/>
+      </w:pPr>
+      <w:r>
+        <w:drawing>
+          <wp:inline xmlns:a="http://schemas.openxmlformats.org/drawingml/2006/main" xmlns:pic="http://schemas.openxmlformats.org/drawingml/2006/picture">
+            <wp:extent cx="5486400" cy="1472679"/>
+            <wp:docPr id="1" name="Picture 1"/>
+            <wp:cNvGraphicFramePr>
+              <a:graphicFrameLocks noChangeAspect="1"/>
+            </wp:cNvGraphicFramePr>
+            <a:graphic>
+              <a:graphicData uri="http://schemas.openxmlformats.org/drawingml/2006/picture">
+                <pic:pic>
+                  <pic:nvPicPr>
+                    <pic:cNvPr id="0" name="T5-3-stem-plant-context.png"/>
+                    <pic:cNvPicPr/>
+                  </pic:nvPicPr>
+                  <pic:blipFill>
+                    <a:blip r:embed="rId9"/>
+                    <a:stretch>
+                      <a:fillRect/>
+                    </a:stretch>
+                  </pic:blipFill>
+                  <pic:spPr>
+                    <a:xfrm>
+                      <a:off x="0" y="0"/>
+                      <a:ext cx="5486400" cy="1472679"/>
+                    </a:xfrm>
+                    <a:prstGeom prst="rect"/>
+                  </pic:spPr>
+                </pic:pic>
+              </a:graphicData>
+            </a:graphic>
+          </wp:inline>
+        </w:drawing>
+      </w:r>
+    </w:p>
+    <w:p>
+      <w:pPr>
+        <w:spacing w:after="120"/>
+        <w:jc w:val="center"/>
+      </w:pPr>
+      <w:r>
+        <w:rPr>
+          <w:rFonts w:ascii="Microsoft YaHei" w:hAnsi="Microsoft YaHei" w:eastAsia="Microsoft YaHei"/>
+          <w:b w:val="0"/>
+          <w:sz w:val="18"/>
+        </w:rPr>
+        <w:t>T5-3 牵引辊复合控制对象结构图</w:t>
+      </w:r>
+    </w:p>
+    <w:p>
+      <w:pPr>
+        <w:spacing w:after="80"/>
+      </w:pPr>
+      <w:r>
+        <w:rPr>
+          <w:rFonts w:ascii="Microsoft YaHei" w:hAnsi="Microsoft YaHei" w:eastAsia="Microsoft YaHei"/>
+          <w:b w:val="0"/>
+          <w:sz w:val="22"/>
+        </w:rPr>
+        <w:t>生产要求中，速度给定 $r(t)$ 常出现小幅阶跃调整和缓慢斜坡升速；扰动 $d(t)$ 以低频缓慢变化为主，偶尔出现短时突变。现场已有单一速度负反馈 `PI` 控制，但仍观察到以下问题：</w:t>
       </w:r>
     </w:p>
     <w:p>
@@ -355,7 +470,7 @@
           <w:b w:val="0"/>
           <w:sz w:val="22"/>
         </w:rPr>
-        <w:t>给出每一目标项的归一化基准；若题目中未给明确基准，需给出你选择基准的理由与替代表达。</w:t>
+        <w:t>给定速度变化时，辊筒速度明显滞后，接近目标值前有轻微超调。</w:t>
       </w:r>
     </w:p>
     <w:p>
@@ -369,7 +484,7 @@
           <w:b w:val="0"/>
           <w:sz w:val="22"/>
         </w:rPr>
-        <w:t>给出权重偏好与排序，体现快慢、精度、鲁棒、节能之间的工程取舍。</w:t>
+        <w:t>负载突变后速度下跌，恢复时间较长。</w:t>
       </w:r>
     </w:p>
     <w:p>
@@ -383,165 +498,7 @@
           <w:b w:val="0"/>
           <w:sz w:val="22"/>
         </w:rPr>
-        <w:t>写出一条单一目标函数形式的无约束加权目标函数表达式，并说明其工程解释。</w:t>
-      </w:r>
-    </w:p>
-    <w:p>
-      <w:pPr>
-        <w:spacing w:after="80"/>
-      </w:pPr>
-      <w:r>
-        <w:rPr>
-          <w:rFonts w:ascii="Microsoft YaHei" w:hAnsi="Microsoft YaHei" w:eastAsia="Microsoft YaHei"/>
-          <w:b w:val="0"/>
-          <w:sz w:val="22"/>
-        </w:rPr>
-        <w:t>本题只要求建立目标函数语言，不要求给出最终最优参数、罚函数或 `fmincon` 式求解步骤。</w:t>
-      </w:r>
-    </w:p>
-    <w:p>
-      <w:pPr>
-        <w:spacing w:before="160" w:after="120"/>
-      </w:pPr>
-      <w:r>
-        <w:rPr>
-          <w:rFonts w:ascii="Microsoft YaHei" w:hAnsi="Microsoft YaHei" w:eastAsia="Microsoft YaHei"/>
-          <w:b/>
-          <w:sz w:val="26"/>
-        </w:rPr>
-        <w:t>T5-3 首轮证据到无约束优化建模判断（20分）</w:t>
-      </w:r>
-    </w:p>
-    <w:p>
-      <w:pPr>
-        <w:spacing w:after="80"/>
-      </w:pPr>
-      <w:r>
-        <w:rPr>
-          <w:rFonts w:ascii="Microsoft YaHei" w:hAnsi="Microsoft YaHei" w:eastAsia="Microsoft YaHei"/>
-          <w:b w:val="0"/>
-          <w:sz w:val="22"/>
-        </w:rPr>
-        <w:t>你正在对一台小型温控回路做首轮方案评审。学生端已完成首轮设计并得到如下数据，请完成判断，不要写最终控制律参数寻优步骤。</w:t>
-      </w:r>
-    </w:p>
-    <w:p>
-      <w:pPr>
-        <w:spacing w:after="80"/>
-      </w:pPr>
-      <w:r>
-        <w:rPr>
-          <w:rFonts w:ascii="Microsoft YaHei" w:hAnsi="Microsoft YaHei" w:eastAsia="Microsoft YaHei"/>
-          <w:b w:val="0"/>
-          <w:sz w:val="22"/>
-        </w:rPr>
-        <w:t>**首轮方案**</w:t>
-      </w:r>
-    </w:p>
-    <w:p>
-      <w:pPr>
-        <w:spacing w:after="80"/>
-      </w:pPr>
-      <w:r>
-        <w:rPr>
-          <w:rFonts w:ascii="Microsoft YaHei" w:hAnsi="Microsoft YaHei" w:eastAsia="Microsoft YaHei"/>
-          <w:b w:val="0"/>
-          <w:sz w:val="22"/>
-        </w:rPr>
-        <w:t>| 部件 | 设定 | 说明 | |---|---|---| | 控制器结构 | PI(D) 并联控制，仅含 $K_p,K_i$，暂不调整 $T_d$ | 采样周期 $0.5\,\mathrm{s}$ | | 变量 | $y$：被控变量温度；$u$：执行器开度；$r$：设定温度；$d$：负载扰动 | 题内已给定 | | 第一轮参数 | $K_p=1.2,\ K_i=0.45$ | 通过一次整定得到 |</w:t>
-      </w:r>
-    </w:p>
-    <w:p>
-      <w:pPr>
-        <w:spacing w:after="80"/>
-      </w:pPr>
-      <w:r>
-        <w:rPr>
-          <w:rFonts w:ascii="Microsoft YaHei" w:hAnsi="Microsoft YaHei" w:eastAsia="Microsoft YaHei"/>
-          <w:b w:val="0"/>
-          <w:sz w:val="22"/>
-        </w:rPr>
-        <w:t>**首轮验证表**</w:t>
-      </w:r>
-    </w:p>
-    <w:p>
-      <w:pPr>
-        <w:spacing w:after="80"/>
-      </w:pPr>
-      <w:r>
-        <w:rPr>
-          <w:rFonts w:ascii="Microsoft YaHei" w:hAnsi="Microsoft YaHei" w:eastAsia="Microsoft YaHei"/>
-          <w:b w:val="0"/>
-          <w:sz w:val="22"/>
-        </w:rPr>
-        <w:t>| 工况 | 重点指标 | 结果 | 可判断信息 | |---|---|---:|---| | 工况 A：负载突升 | 调节时间 $t_s$ | $13\,\mathrm{s}$ | 反应相对较快，但仍需看振铃和动作代价 | | 工况 A | 最大超调 $M_p$ | $9\%$ | 响应存在过冲风险 | | 工况 A | 偏差稳态误差 $e_{ss}$ | $2.5\,\mathrm{K}$ | 稳态偏差尚需跟踪 | | 工况 B：扰动抑制 | 抑制残差 | $1.8\,\mathrm{K}$ | 抗扰仍有残差 | | 工况 B | 执行器变动幅度 | $4.2$ | 控制动作偏猛 |</w:t>
-      </w:r>
-    </w:p>
-    <w:p>
-      <w:pPr>
-        <w:spacing w:after="80"/>
-      </w:pPr>
-      <w:r>
-        <w:rPr>
-          <w:rFonts w:ascii="Microsoft YaHei" w:hAnsi="Microsoft YaHei" w:eastAsia="Microsoft YaHei"/>
-          <w:b w:val="0"/>
-          <w:sz w:val="22"/>
-        </w:rPr>
-        <w:t>**候选目标项与 Pareto 片段**</w:t>
-      </w:r>
-    </w:p>
-    <w:p>
-      <w:pPr>
-        <w:pStyle w:val="ListBullet"/>
-        <w:spacing w:after="80"/>
-      </w:pPr>
-      <w:r>
-        <w:rPr>
-          <w:rFonts w:ascii="Microsoft YaHei" w:hAnsi="Microsoft YaHei" w:eastAsia="Microsoft YaHei"/>
-          <w:b w:val="0"/>
-          <w:sz w:val="22"/>
-        </w:rPr>
-        <w:t>候选目标项：$t_s$（越小越好）、$M_p$（越小越好）、$e_{ss}$（越小越好）、$u$ 变化幅度（越小越好）。</w:t>
-      </w:r>
-    </w:p>
-    <w:p>
-      <w:pPr>
-        <w:pStyle w:val="ListBullet"/>
-        <w:spacing w:after="80"/>
-      </w:pPr>
-      <w:r>
-        <w:rPr>
-          <w:rFonts w:ascii="Microsoft YaHei" w:hAnsi="Microsoft YaHei" w:eastAsia="Microsoft YaHei"/>
-          <w:b w:val="0"/>
-          <w:sz w:val="22"/>
-        </w:rPr>
-        <w:t>候选无约束解片段：</w:t>
-      </w:r>
-    </w:p>
-    <w:p>
-      <w:pPr>
-        <w:spacing w:after="80"/>
-      </w:pPr>
-      <w:r>
-        <w:rPr>
-          <w:rFonts w:ascii="Microsoft YaHei" w:hAnsi="Microsoft YaHei" w:eastAsia="Microsoft YaHei"/>
-          <w:b w:val="0"/>
-          <w:sz w:val="22"/>
-        </w:rPr>
-        <w:t>| 候选解 | $(K_p,K_i)$ | $(t_s,M_p,e_{ss},u)$ | |---|---|---| | $x_A$ | $(1.8,0.90)$ | $(9\,\mathrm{s},12\%,2.1\,\mathrm{K},5.8)$ | | $x_B$ | $(1.1,0.35)$ | $(15\,\mathrm{s},6\%,2.6\,\mathrm{K},3.6)$ | | $x_C$ | $(1.4,0.60)$ | $(11\,\mathrm{s},8\%,2.3\,\mathrm{K},4.5)$ |</w:t>
-      </w:r>
-    </w:p>
-    <w:p>
-      <w:pPr>
-        <w:spacing w:after="80"/>
-      </w:pPr>
-      <w:r>
-        <w:rPr>
-          <w:rFonts w:ascii="Microsoft YaHei" w:hAnsi="Microsoft YaHei" w:eastAsia="Microsoft YaHei"/>
-          <w:b w:val="0"/>
-          <w:sz w:val="22"/>
-        </w:rPr>
-        <w:t>请回答：</w:t>
+        <w:t>张力波动时速度曲线出现低频摆动。</w:t>
       </w:r>
     </w:p>
     <w:p>
@@ -555,7 +512,33 @@
           <w:b w:val="0"/>
           <w:sz w:val="22"/>
         </w:rPr>
-        <w:t>确定本题可作为建模变量的最小变量集合，并说明只用本题信息就能支撑。</w:t>
+        <w:t>若控制作用变化过快，执行器容易出现电压限幅和机械冲击。</w:t>
+      </w:r>
+    </w:p>
+    <w:p>
+      <w:pPr>
+        <w:spacing w:after="80"/>
+      </w:pPr>
+      <w:r>
+        <w:rPr>
+          <w:rFonts w:ascii="Microsoft YaHei" w:hAnsi="Microsoft YaHei" w:eastAsia="Microsoft YaHei"/>
+          <w:b w:val="0"/>
+          <w:sz w:val="22"/>
+        </w:rPr>
+        <w:t>请在不改变被控对象的前提下，选择一种你认为合理的经典复合控制方案。可选手段包括但不限于：速度反馈 `PI/PID`、给定前馈、扰动前馈、串级控制、测速滤波、超前或滞后校正、陷波环节、延迟补偿等。你不需要从清单中全部选用，也可以组合其中若干项。</w:t>
+      </w:r>
+    </w:p>
+    <w:p>
+      <w:pPr>
+        <w:spacing w:after="80"/>
+      </w:pPr>
+      <w:r>
+        <w:rPr>
+          <w:rFonts w:ascii="Microsoft YaHei" w:hAnsi="Microsoft YaHei" w:eastAsia="Microsoft YaHei"/>
+          <w:b w:val="0"/>
+          <w:sz w:val="22"/>
+        </w:rPr>
+        <w:t>请完成：</w:t>
       </w:r>
     </w:p>
     <w:p>
@@ -569,7 +552,7 @@
           <w:b w:val="0"/>
           <w:sz w:val="22"/>
         </w:rPr>
-        <w:t>根据验证表与候选片段，给出一个无约束目标函数的候选形式，至少包含 `2` 个目标项。</w:t>
+        <w:t>写出你选择的复合控制结构，并用文字或框图说明信号连接关系。</w:t>
       </w:r>
     </w:p>
     <w:p>
@@ -583,7 +566,7 @@
           <w:b w:val="0"/>
           <w:sz w:val="22"/>
         </w:rPr>
-        <w:t>判断权重偏好线索：在本场景中更应突出哪个目标优先级，为什么？</w:t>
+        <w:t>说明各组成部分的作用，包括至少一个反馈环节和至少一个额外补偿或辅助环节。</w:t>
       </w:r>
     </w:p>
     <w:p>
@@ -597,7 +580,7 @@
           <w:b w:val="0"/>
           <w:sz w:val="22"/>
         </w:rPr>
-        <w:t>对上述 `3` 个候选解，给出其在 Pareto 语义上的含义，例如快、稳、能量代价之间的权衡。</w:t>
+        <w:t>指出该方案预期改善的至少两个指标或现象，并说明原因。</w:t>
       </w:r>
     </w:p>
     <w:p>
@@ -611,7 +594,21 @@
           <w:b w:val="0"/>
           <w:sz w:val="22"/>
         </w:rPr>
-        <w:t>指出哪些约束信息必须先显化为后续验证条件，而不能在本题直接写进约束内求解。</w:t>
+        <w:t>说明该方案可能带来的副作用或实施时需要关注的验证点。</w:t>
+      </w:r>
+    </w:p>
+    <w:p>
+      <w:pPr>
+        <w:pStyle w:val="ListNumber"/>
+        <w:spacing w:after="80"/>
+      </w:pPr>
+      <w:r>
+        <w:rPr>
+          <w:rFonts w:ascii="Microsoft YaHei" w:hAnsi="Microsoft YaHei" w:eastAsia="Microsoft YaHei"/>
+          <w:b w:val="0"/>
+          <w:sz w:val="22"/>
+        </w:rPr>
+        <w:t>说明为什么你的方案适合本对象的输入信号或扰动特征。</w:t>
       </w:r>
     </w:p>
     <w:p>
@@ -624,7 +621,7 @@
           <w:b w:val="0"/>
           <w:sz w:val="22"/>
         </w:rPr>
-        <w:t>要求：不要给最终最优参数；不允许出现罚函数、约束内求解、`fmincon`、场景迁移；不要从零重做完整控制器设计；作答需在本题信息内独立完成。</w:t>
+        <w:t>本题答案不唯一。只要方案针对题中对象和现象，属于经典控制范畴，结构自洽，并能说明改善理由，即可按评分标准给分。本题不要求仿真验证。</w:t>
       </w:r>
     </w:p>
     <w:p>
@@ -637,7 +634,7 @@
           <w:b/>
           <w:sz w:val="26"/>
         </w:rPr>
-        <w:t>O5 初始控制方案（40分）</w:t>
+        <w:t>O5 传统校正初始控制方案（40分）</w:t>
       </w:r>
     </w:p>
     <w:p>
@@ -650,7 +647,7 @@
           <w:b w:val="0"/>
           <w:sz w:val="22"/>
         </w:rPr>
-        <w:t>请沿用你在 `O4` 中已经保留的首选候选结构与放弃理由，不得更换对象，也不得推翻 `O3-O4` 的主线证据。围绕同一对象，完成一次“初始控制方案”提交。</w:t>
+        <w:t>请沿用你在 `O4` 中已经保留的首选候选结构与放弃理由，不得更换对象，也不得推翻 `O3-O4` 的主线证据。围绕同一对象，完成一次基于传统校正技术的“初始控制方案”提交。</w:t>
       </w:r>
     </w:p>
     <w:p>
@@ -691,7 +688,7 @@
           <w:b w:val="0"/>
           <w:sz w:val="22"/>
         </w:rPr>
-        <w:t>写出本次任务的目标与约束表达：至少包含一个主要性能目标、一个不能破坏的边界和一个可接受的首轮偏差。</w:t>
+        <w:t>写出本次任务的性能要求、验收边界和可接受的首轮偏差。</w:t>
       </w:r>
     </w:p>
     <w:p>
@@ -705,7 +702,7 @@
           <w:b w:val="0"/>
           <w:sz w:val="22"/>
         </w:rPr>
-        <w:t>写出所选结构的表达式、关键参数及参数方向。</w:t>
+        <w:t>完成一次结构选型计算：至少给出一个关键指标的计算过程，例如超前补偿相位、滞后低频增益提升、PI 参数起点或 PID 主参数方向。</w:t>
       </w:r>
     </w:p>
     <w:p>
@@ -719,7 +716,7 @@
           <w:b w:val="0"/>
           <w:sz w:val="22"/>
         </w:rPr>
-        <w:t>给出首轮参数起点，并说明这些参数如何来自 `O4` 的证据、`T5-1` 的参数起点计算或本次合理试探。</w:t>
+        <w:t>写出所选基础结构的表达式、关键参数及参数方向，并用 `MATLAB/Octave` 完成基础结构的首轮仿真验证。</w:t>
       </w:r>
     </w:p>
     <w:p>
@@ -733,7 +730,7 @@
           <w:b w:val="0"/>
           <w:sz w:val="22"/>
         </w:rPr>
-        <w:t>用 `MATLAB/Octave` 完成一次首轮验证，提交代码、结果图和一张首轮验证记录表。</w:t>
+        <w:t>在基础结构上选择一个经典复合结构，例如给定滤波、扰动前馈、速度前馈、限幅与抗饱和、滞后补偿或超前补偿的组合；说明每个附加环节回应的项目背景证据。</w:t>
       </w:r>
     </w:p>
     <w:p>
@@ -747,7 +744,35 @@
           <w:b w:val="0"/>
           <w:sz w:val="22"/>
         </w:rPr>
-        <w:t>根据验证结果写出参数优化入口卡：列出固定结构下可调整的参数、归一化基准、目标项和权重偏好。</w:t>
+        <w:t>为复合结构建立项目背景中的输入信号或扰动模型，不得只使用单位阶跃；例如斜坡给定、周期给定、负载阶跃、周期扰动或测量噪声。</w:t>
+      </w:r>
+    </w:p>
+    <w:p>
+      <w:pPr>
+        <w:pStyle w:val="ListNumber"/>
+        <w:spacing w:after="80"/>
+      </w:pPr>
+      <w:r>
+        <w:rPr>
+          <w:rFonts w:ascii="Microsoft YaHei" w:hAnsi="Microsoft YaHei" w:eastAsia="Microsoft YaHei"/>
+          <w:b w:val="0"/>
+          <w:sz w:val="22"/>
+        </w:rPr>
+        <w:t>用 `MATLAB/Octave` 完成复合结构仿真验证，提交代码、结果图和一张仿真验证记录表。</w:t>
+      </w:r>
+    </w:p>
+    <w:p>
+      <w:pPr>
+        <w:pStyle w:val="ListNumber"/>
+        <w:spacing w:after="80"/>
+      </w:pPr>
+      <w:r>
+        <w:rPr>
+          <w:rFonts w:ascii="Microsoft YaHei" w:hAnsi="Microsoft YaHei" w:eastAsia="Microsoft YaHei"/>
+          <w:b w:val="0"/>
+          <w:sz w:val="22"/>
+        </w:rPr>
+        <w:t>根据验证结果写出下一轮调参问题清单：列出最需要优先处理的 `3` 个问题及对应证据。</w:t>
       </w:r>
     </w:p>
     <w:p>
@@ -774,7 +799,7 @@
           <w:b w:val="0"/>
           <w:sz w:val="22"/>
         </w:rPr>
-        <w:t>提交约束：</w:t>
+        <w:t>提交要求：</w:t>
       </w:r>
     </w:p>
     <w:p>
@@ -802,7 +827,7 @@
           <w:b w:val="0"/>
           <w:sz w:val="22"/>
         </w:rPr>
-        <w:t>必须附 `1` 张方案结构图或等价结构表达。</w:t>
+        <w:t>必须附 `1` 张方案结构图或等价结构表达，图中应区分基础结构与复合附加环节。</w:t>
       </w:r>
     </w:p>
     <w:p>
@@ -816,7 +841,7 @@
           <w:b w:val="0"/>
           <w:sz w:val="22"/>
         </w:rPr>
-        <w:t>必须附 `1` 张首轮验证记录表。</w:t>
+        <w:t>必须附 `1` 段结构选型计算。</w:t>
       </w:r>
     </w:p>
     <w:p>
@@ -830,7 +855,7 @@
           <w:b w:val="0"/>
           <w:sz w:val="22"/>
         </w:rPr>
-        <w:t>必须附 `1` 张参数优化入口卡或无约束候选解释摘要。</w:t>
+        <w:t>必须附 `1` 张基础结构与复合结构的仿真验证记录表。</w:t>
       </w:r>
     </w:p>
     <w:p>
@@ -844,7 +869,7 @@
           <w:b w:val="0"/>
           <w:sz w:val="22"/>
         </w:rPr>
-        <w:t>必须附 `MATLAB/Octave` 仿真代码、结果图与简短复现实验说明。</w:t>
+        <w:t>必须附 `1` 张下一轮调参问题清单。</w:t>
       </w:r>
     </w:p>
     <w:p>
@@ -858,7 +883,7 @@
           <w:b w:val="0"/>
           <w:sz w:val="22"/>
         </w:rPr>
-        <w:t>允许首轮方案不满足全部指标，但必须说明证据指向的参数优化入口。</w:t>
+        <w:t>必须附 `MATLAB/Octave` 仿真代码、结果图与简短复现实验说明；复合结构验证必须包含项目背景中的输入信号或扰动模型。</w:t>
       </w:r>
     </w:p>
     <w:p>
@@ -872,7 +897,7 @@
           <w:b w:val="0"/>
           <w:sz w:val="22"/>
         </w:rPr>
-        <w:t>不得提交约束内最优解，不得使用罚函数或 `fmincon`，不得做场景迁移结论。</w:t>
+        <w:t>允许首轮方案不满足全部指标，但必须说明证据指向的下一轮调参方向。</w:t>
       </w:r>
     </w:p>
     <w:sectPr>

</xml_diff>